<commit_message>
Add the UiBank fallback, Demo Time, and Autopilot in Studio Desktop naming
- Name the UiBank fallback URL wherever uibank.uipath.com appears, including the design document
- Rename Autopilot in Studio to Autopilot in Studio Desktop
- Name the Test Manager project in the requirements prompt; keep the Autopilot warning in its tab
- Put the Executions cards on one row and use Find with Autopilot
- Remove the This week and Next 30 days lists from Next Steps
- Add a Demo Time summary for the SAP Heatmap
- Use US spelling (summarize, analyze, recognizable)

Co-Authored-By: Claude Opus 5.5 <noreply@anthropic.com>
</commit_message>
<xml_diff>
--- a/docs/resources.assets/E2E UiBank Online Banking.docx
+++ b/docs/resources.assets/E2E UiBank Online Banking.docx
@@ -293,7 +293,7 @@
               <w:rPr>
                 <w:sz w:val="20"/>
               </w:rPr>
-              <w:t>https://uibank.uipath.com (UiPath demo banking application) - Google Chrome</w:t>
+              <w:t>https://uibank.uipath.com (UiPath demo banking application) - Google Chrome. Fallback, the same application: https://purple-dune-0af054403.6.azurestaticapps.net</w:t>
             </w:r>
           </w:p>
         </w:tc>
@@ -1111,7 +1111,7 @@
       </w:r>
       <w:r>
         <w:tab/>
-        <w:t>Open Chrome and navigate to https://uibank.uipath.com.</w:t>
+        <w:t>Open Chrome and navigate to https://uibank.uipath.com (fallback: https://purple-dune-0af054403.6.azurestaticapps.net).</w:t>
       </w:r>
     </w:p>
     <w:p>
@@ -1127,7 +1127,7 @@
       </w:r>
       <w:r>
         <w:tab/>
-        <w:t>On the Login page (https://uibank.uipath.com/login, heading "Login", subtitle "Hello! Log in with your email.") type var_Username in the field "Enter username" and var_Password in the field "Enter password".</w:t>
+        <w:t>On the Login page (https://uibank.uipath.com/login, or https://purple-dune-0af054403.6.azurestaticapps.net/login on the fallback, heading "Login", subtitle "Hello! Log in with your email.") type var_Username in the field "Enter username" and var_Password in the field "Enter password".</w:t>
       </w:r>
     </w:p>
     <w:p>

</xml_diff>